<commit_message>
Final R coursework changes
</commit_message>
<xml_diff>
--- a/Coursework_Submission_Folder/Gene_expression/Output.docx
+++ b/Coursework_Submission_Folder/Gene_expression/Output.docx
@@ -2,65 +2,84 @@
 <file path=word/document.xml><?xml version="1.0" encoding="utf-8"?>
 <w:document xmlns:wpc="http://schemas.microsoft.com/office/word/2010/wordprocessingCanvas" xmlns:cx="http://schemas.microsoft.com/office/drawing/2014/chartex" xmlns:cx1="http://schemas.microsoft.com/office/drawing/2015/9/8/chartex" xmlns:cx2="http://schemas.microsoft.com/office/drawing/2015/10/21/chartex" xmlns:cx3="http://schemas.microsoft.com/office/drawing/2016/5/9/chartex" xmlns:cx4="http://schemas.microsoft.com/office/drawing/2016/5/10/chartex" xmlns:cx5="http://schemas.microsoft.com/office/drawing/2016/5/11/chartex" xmlns:cx6="http://schemas.microsoft.com/office/drawing/2016/5/12/chartex" xmlns:cx7="http://schemas.microsoft.com/office/drawing/2016/5/13/chartex" xmlns:cx8="http://schemas.microsoft.com/office/drawing/2016/5/14/chartex" xmlns:mc="http://schemas.openxmlformats.org/markup-compatibility/2006" xmlns:aink="http://schemas.microsoft.com/office/drawing/2016/ink" xmlns:am3d="http://schemas.microsoft.com/office/drawing/2017/model3d" xmlns:o="urn:schemas-microsoft-com:office:office" xmlns:oel="http://schemas.microsoft.com/office/2019/extlst" xmlns:r="http://schemas.openxmlformats.org/officeDocument/2006/relationships" xmlns:m="http://schemas.openxmlformats.org/officeDocument/2006/math" xmlns:v="urn:schemas-microsoft-com:vml" xmlns:wp14="http://schemas.microsoft.com/office/word/2010/wordprocessingDrawing" xmlns:wp="http://schemas.openxmlformats.org/drawingml/2006/wordprocessingDrawing" xmlns:w10="urn:schemas-microsoft-com:office:word" xmlns:w="http://schemas.openxmlformats.org/wordprocessingml/2006/main" xmlns:w14="http://schemas.microsoft.com/office/word/2010/wordml" xmlns:w15="http://schemas.microsoft.com/office/word/2012/wordml" xmlns:w16cex="http://schemas.microsoft.com/office/word/2018/wordml/cex" xmlns:w16cid="http://schemas.microsoft.com/office/word/2016/wordml/cid" xmlns:w16="http://schemas.microsoft.com/office/word/2018/wordml" xmlns:w16du="http://schemas.microsoft.com/office/word/2023/wordml/word16du" xmlns:w16sdtdh="http://schemas.microsoft.com/office/word/2020/wordml/sdtdatahash" xmlns:w16sdtfl="http://schemas.microsoft.com/office/word/2024/wordml/sdtformatlock" xmlns:w16se="http://schemas.microsoft.com/office/word/2015/wordml/symex" xmlns:wpg="http://schemas.microsoft.com/office/word/2010/wordprocessingGroup" xmlns:wpi="http://schemas.microsoft.com/office/word/2010/wordprocessingInk" xmlns:wne="http://schemas.microsoft.com/office/word/2006/wordml" xmlns:wps="http://schemas.microsoft.com/office/word/2010/wordprocessingShape" mc:Ignorable="w14 w15 w16se w16cid w16 w16cex w16sdtdh w16sdtfl w16du wp14">
   <w:body>
-    <w:p/>
-    <w:p/>
     <w:p>
-      <w:r>
-        <w:t>Summary statistics.</w:t>
-      </w:r>
-    </w:p>
-    <w:p>
-      <w:r>
-        <w:t>There are 1340 genes with significantly different expression (p &lt; 0.05) in the A VS B dataset. There are 2649 genes with significantly different expression in the A VS F dataset. In the A vs B dataset 666 of these genes are upregulated, whilst 674 are downregulated. In the A vs F dataset 1329 of these genes are upregulated, whilst 1320 are downregulated.</w:t>
+      <w:pPr>
+        <w:jc w:val="center"/>
+      </w:pPr>
+      <w:r>
+        <w:t>R Output</w:t>
       </w:r>
     </w:p>
     <w:p/>
     <w:p>
       <w:r>
-        <w:t xml:space="preserve">Plots. </w:t>
+        <w:t>Summary statistics.</w:t>
       </w:r>
     </w:p>
     <w:p>
       <w:r>
-        <w:t>“Wings” on the volcano plots are a known</w:t>
-      </w:r>
-      <w:r>
-        <w:t xml:space="preserve"> result of plotting data in this way, and originate from either a very low expression, or a low replicate count. </w:t>
-      </w:r>
-    </w:p>
-    <w:p>
-      <w:r>
-        <w:t>MA plot largely showed what was expected, that being that genes which demonstrated larger log2 fold changes were more likely to have significant adjusted p values.</w:t>
-      </w:r>
-    </w:p>
-    <w:p>
-      <w:r>
-        <w:t>Histograms showed in both datasets, genes skewed towards a low adjusted p value. This indicates that for both conditions, there is clearly a large effect on gene expression. The A vs F dataset skewed more strongly towards low adjusted p values than the A vs B dataset, potentially indicating condition F had a greater impact on gene expression than condition B.</w:t>
-      </w:r>
-    </w:p>
-    <w:p>
-      <w:r>
-        <w:t xml:space="preserve">The Heatmaps further indicated this, with the colouration of the </w:t>
-      </w:r>
-      <w:r>
-        <w:t>adjusted p value comparison showing much more apparent darkening (and therefor lower values) for the A vs F comparison, relative to the A vs B comparison.</w:t>
-      </w:r>
-      <w:r>
-        <w:t xml:space="preserve"> This became even more apparent once non significant (p &gt; 0.05) genes were removed.</w:t>
+        <w:t>There are 1340 genes with significantly different expression (p &lt; 0.05) in the A VS B dataset. There are 2649 genes with significantly different expression in the A VS F dataset. In the A vs B dataset 666 of these genes are upregulated, whilst 674 are downregulated. In the A vs F dataset 1329 of these genes are upregulated, whilst 1320 are downregulated.</w:t>
       </w:r>
     </w:p>
     <w:p/>
     <w:p>
       <w:r>
-        <w:t>Tables.</w:t>
+        <w:t xml:space="preserve">Plots. </w:t>
       </w:r>
     </w:p>
     <w:p>
       <w:r>
+        <w:t>“Wings” on the volcano plots are a known</w:t>
+      </w:r>
+      <w:r>
+        <w:t xml:space="preserve"> result of plotting data in this way, and originate from either a very low expression, or a low replicate count. </w:t>
+      </w:r>
+    </w:p>
+    <w:p>
+      <w:r>
+        <w:t>MA plot largely showed what was expected, that being that genes which demonstrated larger log2 fold changes were more likely to have significant adjusted p values.</w:t>
+      </w:r>
+    </w:p>
+    <w:p>
+      <w:r>
+        <w:t>Histograms showed in both datasets, genes skewed towards a low adjusted p value. This indicates that for both conditions, there is clearly a large effect on gene expression. The A vs F dataset skewed more strongly towards low adjusted p values than the A vs B dataset, potentially indicating condition F had a greater impact on gene expression than condition B.</w:t>
+      </w:r>
+    </w:p>
+    <w:p>
+      <w:r>
+        <w:t xml:space="preserve">The Heatmaps further indicated this, with the colouration of the </w:t>
+      </w:r>
+      <w:r>
+        <w:t>adjusted p value comparison showing much more apparent darkening (and therefor lower values) for the A vs F comparison, relative to the A vs B comparison.</w:t>
+      </w:r>
+      <w:r>
+        <w:t xml:space="preserve"> This became even more apparent once non significant (p &gt; 0.05) genes were removed.</w:t>
+      </w:r>
+    </w:p>
+    <w:p/>
+    <w:p>
+      <w:r>
+        <w:t>Tables.</w:t>
+      </w:r>
+    </w:p>
+    <w:p>
+      <w:r>
         <w:t>Tables of the most significantly differently expressed genes</w:t>
       </w:r>
       <w:r>
-        <w:t xml:space="preserve"> (p &gt; 0.001) have been exported as a .csv file in the same directory as this file. These files contain gene IDs, log2 Fold change in expression, the raw p value and adjusted p value.</w:t>
+        <w:t xml:space="preserve"> (p &gt; 0.001) have been exported as a .csv file in the same directory as this file. These files contain gene IDs, log2 Fold change in expression, the raw p value</w:t>
+      </w:r>
+      <w:r>
+        <w:t>s</w:t>
+      </w:r>
+      <w:r>
+        <w:t xml:space="preserve"> and adjusted p value</w:t>
+      </w:r>
+      <w:r>
+        <w:t>s</w:t>
+      </w:r>
+      <w:r>
+        <w:t>.</w:t>
       </w:r>
     </w:p>
     <w:p>

</xml_diff>